<commit_message>
docs: atualiza apostila sobre PostgreSQL para Termux
</commit_message>
<xml_diff>
--- a/docx/PostgreSQL_Termux/PostgreSQL_Termux.docx
+++ b/docx/PostgreSQL_Termux/PostgreSQL_Termux.docx
@@ -159,12 +159,12 @@
           <wp:inline distB="114300" distT="114300" distL="114300" distR="114300">
             <wp:extent cx="2215988" cy="2219987"/>
             <wp:effectExtent b="0" l="0" r="0" t="0"/>
-            <wp:docPr id="2" name="image2.png"/>
+            <wp:docPr id="2" name="image1.png"/>
             <a:graphic>
               <a:graphicData uri="http://schemas.openxmlformats.org/drawingml/2006/picture">
                 <pic:pic>
                   <pic:nvPicPr>
-                    <pic:cNvPr id="0" name="image2.png"/>
+                    <pic:cNvPr id="0" name="image1.png"/>
                     <pic:cNvPicPr preferRelativeResize="0"/>
                   </pic:nvPicPr>
                   <pic:blipFill>
@@ -194,12 +194,12 @@
           <wp:inline distB="114300" distT="114300" distL="114300" distR="114300">
             <wp:extent cx="2370300" cy="2370300"/>
             <wp:effectExtent b="0" l="0" r="0" t="0"/>
-            <wp:docPr id="1" name="image1.png"/>
+            <wp:docPr id="1" name="image2.png"/>
             <a:graphic>
               <a:graphicData uri="http://schemas.openxmlformats.org/drawingml/2006/picture">
                 <pic:pic>
                   <pic:nvPicPr>
-                    <pic:cNvPr id="0" name="image1.png"/>
+                    <pic:cNvPr id="0" name="image2.png"/>
                     <pic:cNvPicPr preferRelativeResize="0"/>
                   </pic:nvPicPr>
                   <pic:blipFill>
@@ -224,6 +224,20 @@
         </w:drawing>
       </w:r>
       <w:r>
+        <w:rPr>
+          <w:rtl w:val="0"/>
+        </w:rPr>
+      </w:r>
+    </w:p>
+    <w:p>
+      <w:pPr>
+        <w:pStyle w:val="Title"/>
+        <w:jc w:val="center"/>
+        <w:rPr/>
+      </w:pPr>
+      <w:bookmarkStart w:colFirst="0" w:colLast="0" w:name="_s32jngf7bzz9" w:id="1"/>
+      <w:bookmarkEnd w:id="1"/>
+      <w:r>
         <w:br w:type="page"/>
       </w:r>
       <w:r>
@@ -232,13 +246,427 @@
         </w:rPr>
       </w:r>
     </w:p>
+    <w:sdt>
+      <w:sdtPr>
+        <w:id w:val="-169815988"/>
+        <w:docPartObj>
+          <w:docPartGallery w:val="Table of Contents"/>
+          <w:docPartUnique w:val="1"/>
+        </w:docPartObj>
+      </w:sdtPr>
+      <w:sdtContent>
+        <w:p>
+          <w:pPr>
+            <w:widowControl w:val="0"/>
+            <w:tabs>
+              <w:tab w:val="right" w:leader="dot" w:pos="12000"/>
+            </w:tabs>
+            <w:spacing w:before="60" w:line="240" w:lineRule="auto"/>
+            <w:rPr>
+              <w:b w:val="1"/>
+              <w:bCs w:val="1"/>
+              <w:color w:val="000000"/>
+              <w:u w:val="none"/>
+            </w:rPr>
+          </w:pPr>
+          <w:r>
+            <w:fldChar w:fldCharType="begin"/>
+            <w:instrText xml:space="preserve"> TOC \h \u \z \t "Heading 1,1,Heading 2,2,Heading 3,3,Heading 4,4,Heading 5,5,Heading 6,6,"</w:instrText>
+            <w:fldChar w:fldCharType="separate"/>
+          </w:r>
+          <w:hyperlink w:anchor="_tc9y9sacbt68">
+            <w:r>
+              <w:rPr>
+                <w:rFonts w:ascii="Arial" w:cs="Arial" w:eastAsia="Arial" w:hAnsi="Arial"/>
+                <w:b w:val="1"/>
+                <w:bCs w:val="1"/>
+                <w:i w:val="0"/>
+                <w:iCs w:val="0"/>
+                <w:smallCaps w:val="0"/>
+                <w:strike w:val="0"/>
+                <w:color w:val="000000"/>
+                <w:sz w:val="28"/>
+                <w:szCs w:val="28"/>
+                <w:u w:val="none"/>
+                <w:shd w:fill="auto" w:val="clear"/>
+                <w:vertAlign w:val="baseline"/>
+                <w:rtl w:val="0"/>
+              </w:rPr>
+              <w:t xml:space="preserve">Instalação</w:t>
+              <w:tab/>
+              <w:t xml:space="preserve">3</w:t>
+            </w:r>
+          </w:hyperlink>
+          <w:r>
+            <w:rPr>
+              <w:rtl w:val="0"/>
+            </w:rPr>
+          </w:r>
+        </w:p>
+        <w:p>
+          <w:pPr>
+            <w:widowControl w:val="0"/>
+            <w:tabs>
+              <w:tab w:val="right" w:leader="dot" w:pos="12000"/>
+            </w:tabs>
+            <w:spacing w:before="60" w:line="240" w:lineRule="auto"/>
+            <w:ind w:left="360" w:firstLine="0"/>
+            <w:rPr>
+              <w:color w:val="000000"/>
+              <w:u w:val="none"/>
+            </w:rPr>
+          </w:pPr>
+          <w:hyperlink w:anchor="_lsjq1afiovum">
+            <w:r>
+              <w:rPr>
+                <w:rFonts w:ascii="Arial" w:cs="Arial" w:eastAsia="Arial" w:hAnsi="Arial"/>
+                <w:b w:val="0"/>
+                <w:bCs w:val="0"/>
+                <w:i w:val="0"/>
+                <w:iCs w:val="0"/>
+                <w:smallCaps w:val="0"/>
+                <w:strike w:val="0"/>
+                <w:color w:val="000000"/>
+                <w:sz w:val="28"/>
+                <w:szCs w:val="28"/>
+                <w:u w:val="none"/>
+                <w:shd w:fill="auto" w:val="clear"/>
+                <w:vertAlign w:val="baseline"/>
+                <w:rtl w:val="0"/>
+              </w:rPr>
+              <w:t xml:space="preserve">Atualizar Pacotes</w:t>
+              <w:tab/>
+              <w:t xml:space="preserve">3</w:t>
+            </w:r>
+          </w:hyperlink>
+          <w:r>
+            <w:rPr>
+              <w:rtl w:val="0"/>
+            </w:rPr>
+          </w:r>
+        </w:p>
+        <w:p>
+          <w:pPr>
+            <w:widowControl w:val="0"/>
+            <w:tabs>
+              <w:tab w:val="right" w:leader="dot" w:pos="12000"/>
+            </w:tabs>
+            <w:spacing w:before="60" w:line="240" w:lineRule="auto"/>
+            <w:ind w:left="360" w:firstLine="0"/>
+            <w:rPr>
+              <w:color w:val="000000"/>
+              <w:u w:val="none"/>
+            </w:rPr>
+          </w:pPr>
+          <w:hyperlink w:anchor="_stklmauqq934">
+            <w:r>
+              <w:rPr>
+                <w:rFonts w:ascii="Arial" w:cs="Arial" w:eastAsia="Arial" w:hAnsi="Arial"/>
+                <w:b w:val="0"/>
+                <w:bCs w:val="0"/>
+                <w:i w:val="0"/>
+                <w:iCs w:val="0"/>
+                <w:smallCaps w:val="0"/>
+                <w:strike w:val="0"/>
+                <w:color w:val="000000"/>
+                <w:sz w:val="28"/>
+                <w:szCs w:val="28"/>
+                <w:u w:val="none"/>
+                <w:shd w:fill="auto" w:val="clear"/>
+                <w:vertAlign w:val="baseline"/>
+                <w:rtl w:val="0"/>
+              </w:rPr>
+              <w:t xml:space="preserve">Instalar PostgreSQL</w:t>
+              <w:tab/>
+              <w:t xml:space="preserve">3</w:t>
+            </w:r>
+          </w:hyperlink>
+          <w:r>
+            <w:rPr>
+              <w:rtl w:val="0"/>
+            </w:rPr>
+          </w:r>
+        </w:p>
+        <w:p>
+          <w:pPr>
+            <w:widowControl w:val="0"/>
+            <w:tabs>
+              <w:tab w:val="right" w:leader="dot" w:pos="12000"/>
+            </w:tabs>
+            <w:spacing w:before="60" w:line="240" w:lineRule="auto"/>
+            <w:ind w:left="360" w:firstLine="0"/>
+            <w:rPr>
+              <w:color w:val="000000"/>
+              <w:u w:val="none"/>
+            </w:rPr>
+          </w:pPr>
+          <w:hyperlink w:anchor="_nozqihjvmtmj">
+            <w:r>
+              <w:rPr>
+                <w:rFonts w:ascii="Arial" w:cs="Arial" w:eastAsia="Arial" w:hAnsi="Arial"/>
+                <w:b w:val="0"/>
+                <w:bCs w:val="0"/>
+                <w:i w:val="0"/>
+                <w:iCs w:val="0"/>
+                <w:smallCaps w:val="0"/>
+                <w:strike w:val="0"/>
+                <w:color w:val="000000"/>
+                <w:sz w:val="28"/>
+                <w:szCs w:val="28"/>
+                <w:u w:val="none"/>
+                <w:shd w:fill="auto" w:val="clear"/>
+                <w:vertAlign w:val="baseline"/>
+                <w:rtl w:val="0"/>
+              </w:rPr>
+              <w:t xml:space="preserve">Configurar</w:t>
+              <w:tab/>
+              <w:t xml:space="preserve">3</w:t>
+            </w:r>
+          </w:hyperlink>
+          <w:r>
+            <w:rPr>
+              <w:rtl w:val="0"/>
+            </w:rPr>
+          </w:r>
+        </w:p>
+        <w:p>
+          <w:pPr>
+            <w:widowControl w:val="0"/>
+            <w:tabs>
+              <w:tab w:val="right" w:leader="dot" w:pos="12000"/>
+            </w:tabs>
+            <w:spacing w:before="60" w:line="240" w:lineRule="auto"/>
+            <w:ind w:left="360" w:firstLine="0"/>
+            <w:rPr>
+              <w:color w:val="000000"/>
+              <w:u w:val="none"/>
+            </w:rPr>
+          </w:pPr>
+          <w:hyperlink w:anchor="_4ij1tah6bob3">
+            <w:r>
+              <w:rPr>
+                <w:rFonts w:ascii="Arial" w:cs="Arial" w:eastAsia="Arial" w:hAnsi="Arial"/>
+                <w:b w:val="0"/>
+                <w:bCs w:val="0"/>
+                <w:i w:val="0"/>
+                <w:iCs w:val="0"/>
+                <w:smallCaps w:val="0"/>
+                <w:strike w:val="0"/>
+                <w:color w:val="000000"/>
+                <w:sz w:val="28"/>
+                <w:szCs w:val="28"/>
+                <w:u w:val="none"/>
+                <w:shd w:fill="auto" w:val="clear"/>
+                <w:vertAlign w:val="baseline"/>
+                <w:rtl w:val="0"/>
+              </w:rPr>
+              <w:t xml:space="preserve">Iniciar Server</w:t>
+              <w:tab/>
+              <w:t xml:space="preserve">3</w:t>
+            </w:r>
+          </w:hyperlink>
+          <w:r>
+            <w:rPr>
+              <w:rtl w:val="0"/>
+            </w:rPr>
+          </w:r>
+        </w:p>
+        <w:p>
+          <w:pPr>
+            <w:widowControl w:val="0"/>
+            <w:tabs>
+              <w:tab w:val="right" w:leader="dot" w:pos="12000"/>
+            </w:tabs>
+            <w:spacing w:before="60" w:line="240" w:lineRule="auto"/>
+            <w:ind w:left="360" w:firstLine="0"/>
+            <w:rPr>
+              <w:color w:val="000000"/>
+              <w:u w:val="none"/>
+            </w:rPr>
+          </w:pPr>
+          <w:hyperlink w:anchor="_t51u6biwktan">
+            <w:r>
+              <w:rPr>
+                <w:rFonts w:ascii="Arial" w:cs="Arial" w:eastAsia="Arial" w:hAnsi="Arial"/>
+                <w:b w:val="0"/>
+                <w:bCs w:val="0"/>
+                <w:i w:val="0"/>
+                <w:iCs w:val="0"/>
+                <w:smallCaps w:val="0"/>
+                <w:strike w:val="0"/>
+                <w:color w:val="000000"/>
+                <w:sz w:val="28"/>
+                <w:szCs w:val="28"/>
+                <w:u w:val="none"/>
+                <w:shd w:fill="auto" w:val="clear"/>
+                <w:vertAlign w:val="baseline"/>
+                <w:rtl w:val="0"/>
+              </w:rPr>
+              <w:t xml:space="preserve">Criar Usuário Administrador</w:t>
+              <w:tab/>
+              <w:t xml:space="preserve">3</w:t>
+            </w:r>
+          </w:hyperlink>
+          <w:r>
+            <w:rPr>
+              <w:rtl w:val="0"/>
+            </w:rPr>
+          </w:r>
+        </w:p>
+        <w:p>
+          <w:pPr>
+            <w:widowControl w:val="0"/>
+            <w:tabs>
+              <w:tab w:val="right" w:leader="dot" w:pos="12000"/>
+            </w:tabs>
+            <w:spacing w:before="60" w:line="240" w:lineRule="auto"/>
+            <w:ind w:left="360" w:firstLine="0"/>
+            <w:rPr>
+              <w:color w:val="000000"/>
+              <w:u w:val="none"/>
+            </w:rPr>
+          </w:pPr>
+          <w:hyperlink w:anchor="_wbumzdgrk0nf">
+            <w:r>
+              <w:rPr>
+                <w:rFonts w:ascii="Arial" w:cs="Arial" w:eastAsia="Arial" w:hAnsi="Arial"/>
+                <w:b w:val="0"/>
+                <w:bCs w:val="0"/>
+                <w:i w:val="0"/>
+                <w:iCs w:val="0"/>
+                <w:smallCaps w:val="0"/>
+                <w:strike w:val="0"/>
+                <w:color w:val="000000"/>
+                <w:sz w:val="28"/>
+                <w:szCs w:val="28"/>
+                <w:u w:val="none"/>
+                <w:shd w:fill="auto" w:val="clear"/>
+                <w:vertAlign w:val="baseline"/>
+                <w:rtl w:val="0"/>
+              </w:rPr>
+              <w:t xml:space="preserve">Acessar PostgreSQL</w:t>
+              <w:tab/>
+              <w:t xml:space="preserve">3</w:t>
+            </w:r>
+          </w:hyperlink>
+          <w:r>
+            <w:rPr>
+              <w:rtl w:val="0"/>
+            </w:rPr>
+          </w:r>
+        </w:p>
+        <w:p>
+          <w:pPr>
+            <w:widowControl w:val="0"/>
+            <w:tabs>
+              <w:tab w:val="right" w:leader="dot" w:pos="12000"/>
+            </w:tabs>
+            <w:spacing w:before="60" w:line="240" w:lineRule="auto"/>
+            <w:ind w:left="360" w:firstLine="0"/>
+            <w:rPr>
+              <w:color w:val="000000"/>
+              <w:u w:val="none"/>
+            </w:rPr>
+          </w:pPr>
+          <w:hyperlink w:anchor="_f4wwcghj7g4c">
+            <w:r>
+              <w:rPr>
+                <w:rFonts w:ascii="Arial" w:cs="Arial" w:eastAsia="Arial" w:hAnsi="Arial"/>
+                <w:b w:val="0"/>
+                <w:bCs w:val="0"/>
+                <w:i w:val="0"/>
+                <w:iCs w:val="0"/>
+                <w:smallCaps w:val="0"/>
+                <w:strike w:val="0"/>
+                <w:color w:val="000000"/>
+                <w:sz w:val="28"/>
+                <w:szCs w:val="28"/>
+                <w:u w:val="none"/>
+                <w:shd w:fill="auto" w:val="clear"/>
+                <w:vertAlign w:val="baseline"/>
+                <w:rtl w:val="0"/>
+              </w:rPr>
+              <w:t xml:space="preserve">Criar Banco de Dados</w:t>
+              <w:tab/>
+              <w:t xml:space="preserve">3</w:t>
+            </w:r>
+          </w:hyperlink>
+          <w:r>
+            <w:rPr>
+              <w:rtl w:val="0"/>
+            </w:rPr>
+          </w:r>
+        </w:p>
+        <w:p>
+          <w:pPr>
+            <w:widowControl w:val="0"/>
+            <w:tabs>
+              <w:tab w:val="right" w:leader="dot" w:pos="12000"/>
+            </w:tabs>
+            <w:spacing w:before="60" w:line="240" w:lineRule="auto"/>
+            <w:ind w:left="360" w:firstLine="0"/>
+            <w:rPr>
+              <w:color w:val="000000"/>
+              <w:u w:val="none"/>
+            </w:rPr>
+          </w:pPr>
+          <w:hyperlink w:anchor="_4mb5l3od0pe6">
+            <w:r>
+              <w:rPr>
+                <w:rFonts w:ascii="Arial" w:cs="Arial" w:eastAsia="Arial" w:hAnsi="Arial"/>
+                <w:b w:val="0"/>
+                <w:bCs w:val="0"/>
+                <w:i w:val="0"/>
+                <w:iCs w:val="0"/>
+                <w:smallCaps w:val="0"/>
+                <w:strike w:val="0"/>
+                <w:color w:val="000000"/>
+                <w:sz w:val="28"/>
+                <w:szCs w:val="28"/>
+                <w:u w:val="none"/>
+                <w:shd w:fill="auto" w:val="clear"/>
+                <w:vertAlign w:val="baseline"/>
+                <w:rtl w:val="0"/>
+              </w:rPr>
+              <w:t xml:space="preserve">Desligar Server</w:t>
+              <w:tab/>
+              <w:t xml:space="preserve">3</w:t>
+            </w:r>
+          </w:hyperlink>
+          <w:r>
+            <w:rPr>
+              <w:rtl w:val="0"/>
+            </w:rPr>
+          </w:r>
+          <w:r>
+            <w:fldChar w:fldCharType="end"/>
+          </w:r>
+        </w:p>
+      </w:sdtContent>
+    </w:sdt>
+    <w:p>
+      <w:pPr>
+        <w:pStyle w:val="Title"/>
+        <w:rPr/>
+      </w:pPr>
+      <w:bookmarkStart w:colFirst="0" w:colLast="0" w:name="_f5iow4not7xg" w:id="2"/>
+      <w:bookmarkEnd w:id="2"/>
+      <w:r>
+        <w:br w:type="page"/>
+      </w:r>
+      <w:r>
+        <w:rPr>
+          <w:rtl w:val="0"/>
+        </w:rPr>
+      </w:r>
+    </w:p>
     <w:p>
       <w:pPr>
         <w:pStyle w:val="Heading1"/>
         <w:rPr/>
       </w:pPr>
-      <w:bookmarkStart w:colFirst="0" w:colLast="0" w:name="_tc9y9sacbt68" w:id="1"/>
-      <w:bookmarkEnd w:id="1"/>
+      <w:bookmarkStart w:colFirst="0" w:colLast="0" w:name="_tc9y9sacbt68" w:id="3"/>
+      <w:bookmarkEnd w:id="3"/>
       <w:r>
         <w:rPr>
           <w:rtl w:val="0"/>
@@ -251,8 +679,8 @@
         <w:pStyle w:val="Heading2"/>
         <w:rPr/>
       </w:pPr>
-      <w:bookmarkStart w:colFirst="0" w:colLast="0" w:name="_lsjq1afiovum" w:id="2"/>
-      <w:bookmarkEnd w:id="2"/>
+      <w:bookmarkStart w:colFirst="0" w:colLast="0" w:name="_lsjq1afiovum" w:id="4"/>
+      <w:bookmarkEnd w:id="4"/>
       <w:r>
         <w:rPr>
           <w:rtl w:val="0"/>
@@ -281,8 +709,8 @@
         <w:pStyle w:val="Heading2"/>
         <w:rPr/>
       </w:pPr>
-      <w:bookmarkStart w:colFirst="0" w:colLast="0" w:name="_stklmauqq934" w:id="3"/>
-      <w:bookmarkEnd w:id="3"/>
+      <w:bookmarkStart w:colFirst="0" w:colLast="0" w:name="_stklmauqq934" w:id="5"/>
+      <w:bookmarkEnd w:id="5"/>
       <w:r>
         <w:rPr>
           <w:rtl w:val="0"/>
@@ -311,8 +739,8 @@
         <w:pStyle w:val="Heading2"/>
         <w:rPr/>
       </w:pPr>
-      <w:bookmarkStart w:colFirst="0" w:colLast="0" w:name="_nozqihjvmtmj" w:id="4"/>
-      <w:bookmarkEnd w:id="4"/>
+      <w:bookmarkStart w:colFirst="0" w:colLast="0" w:name="_nozqihjvmtmj" w:id="6"/>
+      <w:bookmarkEnd w:id="6"/>
       <w:r>
         <w:rPr>
           <w:rtl w:val="0"/>
@@ -373,8 +801,8 @@
           <w:color w:val="38761d"/>
         </w:rPr>
       </w:pPr>
-      <w:bookmarkStart w:colFirst="0" w:colLast="0" w:name="_4ij1tah6bob3" w:id="5"/>
-      <w:bookmarkEnd w:id="5"/>
+      <w:bookmarkStart w:colFirst="0" w:colLast="0" w:name="_4ij1tah6bob3" w:id="7"/>
+      <w:bookmarkEnd w:id="7"/>
       <w:r>
         <w:rPr>
           <w:rtl w:val="0"/>
@@ -411,8 +839,8 @@
           <w:color w:val="38761d"/>
         </w:rPr>
       </w:pPr>
-      <w:bookmarkStart w:colFirst="0" w:colLast="0" w:name="_t51u6biwktan" w:id="6"/>
-      <w:bookmarkEnd w:id="6"/>
+      <w:bookmarkStart w:colFirst="0" w:colLast="0" w:name="_t51u6biwktan" w:id="8"/>
+      <w:bookmarkEnd w:id="8"/>
       <w:r>
         <w:rPr>
           <w:rtl w:val="0"/>
@@ -449,8 +877,8 @@
           <w:color w:val="38761d"/>
         </w:rPr>
       </w:pPr>
-      <w:bookmarkStart w:colFirst="0" w:colLast="0" w:name="_wbumzdgrk0nf" w:id="7"/>
-      <w:bookmarkEnd w:id="7"/>
+      <w:bookmarkStart w:colFirst="0" w:colLast="0" w:name="_wbumzdgrk0nf" w:id="9"/>
+      <w:bookmarkEnd w:id="9"/>
       <w:r>
         <w:rPr>
           <w:rtl w:val="0"/>
@@ -487,8 +915,8 @@
           <w:color w:val="38761d"/>
         </w:rPr>
       </w:pPr>
-      <w:bookmarkStart w:colFirst="0" w:colLast="0" w:name="_f4wwcghj7g4c" w:id="8"/>
-      <w:bookmarkEnd w:id="8"/>
+      <w:bookmarkStart w:colFirst="0" w:colLast="0" w:name="_f4wwcghj7g4c" w:id="10"/>
+      <w:bookmarkEnd w:id="10"/>
       <w:r>
         <w:rPr>
           <w:rtl w:val="0"/>
@@ -525,8 +953,8 @@
           <w:color w:val="38761d"/>
         </w:rPr>
       </w:pPr>
-      <w:bookmarkStart w:colFirst="0" w:colLast="0" w:name="_4mb5l3od0pe6" w:id="9"/>
-      <w:bookmarkEnd w:id="9"/>
+      <w:bookmarkStart w:colFirst="0" w:colLast="0" w:name="_4mb5l3od0pe6" w:id="11"/>
+      <w:bookmarkEnd w:id="11"/>
       <w:r>
         <w:rPr>
           <w:rtl w:val="0"/>
@@ -556,12 +984,53 @@
       </w:r>
     </w:p>
     <w:sectPr>
+      <w:footerReference r:id="rId8" w:type="default"/>
+      <w:footerReference r:id="rId9" w:type="first"/>
       <w:pgSz w:h="16834" w:w="11909" w:orient="portrait"/>
       <w:pgMar w:bottom="1440" w:top="1440" w:left="1440" w:right="1440" w:header="720" w:footer="720"/>
       <w:pgNumType w:start="1"/>
+      <w:titlePg w:val="1"/>
     </w:sectPr>
   </w:body>
 </w:document>
+</file>
+
+<file path=word/footer1.xml><?xml version="1.0" encoding="utf-8"?>
+<w:ftr xmlns:mc="http://schemas.openxmlformats.org/markup-compatibility/2006" xmlns:o="urn:schemas-microsoft-com:office:office" xmlns:r="http://schemas.openxmlformats.org/officeDocument/2006/relationships" xmlns:m="http://schemas.openxmlformats.org/officeDocument/2006/math" xmlns:v="urn:schemas-microsoft-com:vml" xmlns:wp="http://schemas.openxmlformats.org/drawingml/2006/wordprocessingDrawing" xmlns:w10="urn:schemas-microsoft-com:office:word" xmlns:w="http://schemas.openxmlformats.org/wordprocessingml/2006/main" xmlns:wne="http://schemas.microsoft.com/office/word/2006/wordml" xmlns:sl="http://schemas.openxmlformats.org/schemaLibrary/2006/main" xmlns:a="http://schemas.openxmlformats.org/drawingml/2006/main" xmlns:pic="http://schemas.openxmlformats.org/drawingml/2006/picture" xmlns:c="http://schemas.openxmlformats.org/drawingml/2006/chart" xmlns:lc="http://schemas.openxmlformats.org/drawingml/2006/lockedCanvas" xmlns:dgm="http://schemas.openxmlformats.org/drawingml/2006/diagram" xmlns:wps="http://schemas.microsoft.com/office/word/2010/wordprocessingShape" xmlns:wpg="http://schemas.microsoft.com/office/word/2010/wordprocessingGroup" xmlns:w14="http://schemas.microsoft.com/office/word/2010/wordml" xmlns:w15="http://schemas.microsoft.com/office/word/2012/wordml" xmlns:w16="http://schemas.microsoft.com/office/word/2018/wordml" xmlns:w16cex="http://schemas.microsoft.com/office/word/2018/wordml/cex" xmlns:w16cid="http://schemas.microsoft.com/office/word/2016/wordml/cid" xmlns="http://schemas.microsoft.com/office/tasks/2019/documenttasks" xmlns:cr="http://schemas.microsoft.com/office/comments/2020/reactions">
+  <w:p>
+    <w:pPr>
+      <w:rPr/>
+    </w:pPr>
+    <w:r>
+      <w:rPr>
+        <w:rtl w:val="0"/>
+      </w:rPr>
+    </w:r>
+  </w:p>
+</w:ftr>
+</file>
+
+<file path=word/footer2.xml><?xml version="1.0" encoding="utf-8"?>
+<w:ftr xmlns:mc="http://schemas.openxmlformats.org/markup-compatibility/2006" xmlns:o="urn:schemas-microsoft-com:office:office" xmlns:r="http://schemas.openxmlformats.org/officeDocument/2006/relationships" xmlns:m="http://schemas.openxmlformats.org/officeDocument/2006/math" xmlns:v="urn:schemas-microsoft-com:vml" xmlns:wp="http://schemas.openxmlformats.org/drawingml/2006/wordprocessingDrawing" xmlns:w10="urn:schemas-microsoft-com:office:word" xmlns:w="http://schemas.openxmlformats.org/wordprocessingml/2006/main" xmlns:wne="http://schemas.microsoft.com/office/word/2006/wordml" xmlns:sl="http://schemas.openxmlformats.org/schemaLibrary/2006/main" xmlns:a="http://schemas.openxmlformats.org/drawingml/2006/main" xmlns:pic="http://schemas.openxmlformats.org/drawingml/2006/picture" xmlns:c="http://schemas.openxmlformats.org/drawingml/2006/chart" xmlns:lc="http://schemas.openxmlformats.org/drawingml/2006/lockedCanvas" xmlns:dgm="http://schemas.openxmlformats.org/drawingml/2006/diagram" xmlns:wps="http://schemas.microsoft.com/office/word/2010/wordprocessingShape" xmlns:wpg="http://schemas.microsoft.com/office/word/2010/wordprocessingGroup" xmlns:w14="http://schemas.microsoft.com/office/word/2010/wordml" xmlns:w15="http://schemas.microsoft.com/office/word/2012/wordml" xmlns:w16="http://schemas.microsoft.com/office/word/2018/wordml" xmlns:w16cex="http://schemas.microsoft.com/office/word/2018/wordml/cex" xmlns:w16cid="http://schemas.microsoft.com/office/word/2016/wordml/cid" xmlns="http://schemas.microsoft.com/office/tasks/2019/documenttasks" xmlns:cr="http://schemas.microsoft.com/office/comments/2020/reactions">
+  <w:p>
+    <w:pPr>
+      <w:jc w:val="right"/>
+      <w:rPr/>
+    </w:pPr>
+    <w:r>
+      <w:rPr/>
+      <w:fldChar w:fldCharType="begin"/>
+      <w:instrText xml:space="preserve">PAGE</w:instrText>
+      <w:fldChar w:fldCharType="separate"/>
+      <w:fldChar w:fldCharType="end"/>
+    </w:r>
+    <w:r>
+      <w:rPr>
+        <w:rtl w:val="0"/>
+      </w:rPr>
+    </w:r>
+  </w:p>
+</w:ftr>
 </file>
 
 <file path=word/numbering.xml><?xml version="1.0" encoding="utf-8"?>

</xml_diff>